<commit_message>
Pre-submission fixes and move output/ to OSF-only
- Fix typo (concieved → conceived), trailing comma in YAML, appendix
  script filenames, and citation group formatting in .qmd
- Add output/ to .gitignore (fitted models hosted on OSF only)
- Re-render manuscript docx
</commit_message>
<xml_diff>
--- a/manuscript/tutorial-m3-bmm.docx
+++ b/manuscript/tutorial-m3-bmm.docx
@@ -114,7 +114,7 @@
         <w:t xml:space="preserve">3</w:t>
       </w:r>
       <w:r>
-        <w:t xml:space="preserve">Institution for Mind and Biology,, University of Chicago</w:t>
+        <w:t xml:space="preserve">Institution for Mind and Biology, University of Chicago</w:t>
       </w:r>
     </w:p>
     <w:p>
@@ -6425,7 +6425,7 @@
         <w:t xml:space="preserve"> </w:t>
       </w:r>
       <w:r>
-        <w:t xml:space="preserve">= 5.83). The set size effect on</w:t>
+        <w:t xml:space="preserve">= 5.80). The set size effect on</w:t>
       </w:r>
       <w:r>
         <w:t xml:space="preserve"> </w:t>
@@ -6459,7 +6459,7 @@
         <w:t xml:space="preserve"> </w:t>
       </w:r>
       <w:r>
-        <w:t xml:space="preserve">= 61.3). The companion script contains the full set of hypothesis tests.</w:t>
+        <w:t xml:space="preserve">= 61.8). The companion script contains the full set of hypothesis tests.</w:t>
       </w:r>
     </w:p>
     <w:bookmarkEnd w:id="73"/>
@@ -8950,7 +8950,7 @@
           <m:t>=</m:t>
         </m:r>
         <m:r>
-          <m:t>10.1</m:t>
+          <m:t>9.94</m:t>
         </m:r>
       </m:oMath>
       <w:r>
@@ -8993,7 +8993,7 @@
           <m:t>=</m:t>
         </m:r>
         <m:r>
-          <m:t>0.44</m:t>
+          <m:t>0.45</m:t>
         </m:r>
       </m:oMath>
       <w:r>
@@ -9036,7 +9036,7 @@
           <m:t>=</m:t>
         </m:r>
         <m:r>
-          <m:t>7.99</m:t>
+          <m:t>7.35</m:t>
         </m:r>
       </m:oMath>
       <w:r>
@@ -12615,7 +12615,7 @@
         <w:t xml:space="preserve"> </w:t>
       </w:r>
       <w:r>
-        <w:t xml:space="preserve">= 6.11), and the same holds for</w:t>
+        <w:t xml:space="preserve">= 6.17), and the same holds for</w:t>
       </w:r>
       <w:r>
         <w:t xml:space="preserve"> </w:t>
@@ -12658,7 +12658,7 @@
         <w:t xml:space="preserve"> </w:t>
       </w:r>
       <w:r>
-        <w:t xml:space="preserve">= 7.34). Item memory transfers to distractors regardless of cue timing, while context binding is selectively attenuated, consistent with the view that filtering operates on binding rather than item activation.</w:t>
+        <w:t xml:space="preserve">= 7.37). Item memory transfers to distractors regardless of cue timing, while context binding is selectively attenuated, consistent with the view that filtering operates on binding rather than item activation.</w:t>
       </w:r>
     </w:p>
     <w:bookmarkEnd w:id="103"/>
@@ -14100,14 +14100,45 @@
         <w:t xml:space="preserve"> </w:t>
       </w:r>
       <w:r>
-        <w:t xml:space="preserve">Talts et al. (</w:t>
+        <w:t xml:space="preserve">(for a systematic approach, see</w:t>
+      </w:r>
+      <w:r>
+        <w:t xml:space="preserve"> </w:t>
+      </w:r>
+      <w:hyperlink w:anchor="ref-goettmann2025recovery">
+        <w:r>
+          <w:rPr>
+            <w:rStyle w:val="Hyperlink"/>
+          </w:rPr>
+          <w:t xml:space="preserve">Göttmann et al., 2025</w:t>
+        </w:r>
+      </w:hyperlink>
+      <w:r>
+        <w:t xml:space="preserve">; for implementation tools, see</w:t>
+      </w:r>
+      <w:r>
+        <w:t xml:space="preserve"> </w:t>
+      </w:r>
+      <w:hyperlink w:anchor="ref-chalmers2020simdesign">
+        <w:r>
+          <w:rPr>
+            <w:rStyle w:val="Hyperlink"/>
+          </w:rPr>
+          <w:t xml:space="preserve">Chalmers &amp; Adkins, 2020</w:t>
+        </w:r>
+      </w:hyperlink>
+      <w:r>
+        <w:t xml:space="preserve">; for a complementary calibration-based approach, see</w:t>
+      </w:r>
+      <w:r>
+        <w:t xml:space="preserve"> </w:t>
       </w:r>
       <w:hyperlink w:anchor="ref-talts2018validating">
         <w:r>
           <w:rPr>
             <w:rStyle w:val="Hyperlink"/>
           </w:rPr>
-          <w:t xml:space="preserve">2018</w:t>
+          <w:t xml:space="preserve">Talts et al., 2018</w:t>
         </w:r>
       </w:hyperlink>
       <w:r>
@@ -14184,7 +14215,7 @@
         <w:rPr>
           <w:rStyle w:val="VerbatimChar"/>
         </w:rPr>
-        <w:t xml:space="preserve">scripts/tutorial3_parameter_recovery_simple.R</w:t>
+        <w:t xml:space="preserve">scripts/tutorial5_parameter_recovery_updating_simple.R</w:t>
       </w:r>
       <w:r>
         <w:t xml:space="preserve"> </w:t>
@@ -14199,7 +14230,7 @@
         <w:rPr>
           <w:rStyle w:val="VerbatimChar"/>
         </w:rPr>
-        <w:t xml:space="preserve">scripts/tutorial3_parameter_recovery.R</w:t>
+        <w:t xml:space="preserve">scripts/tutorial5_parameter_recovery_updating.R</w:t>
       </w:r>
       <w:r>
         <w:t xml:space="preserve">) provide the complete code for this advanced example.</w:t>
@@ -18895,7 +18926,7 @@
         <w:t xml:space="preserve"> </w:t>
       </w:r>
       <w:r>
-        <w:t xml:space="preserve">framework was concieved as a measurement tool, it can thus be used to implement and test specific theoretical assumptions. For example, similarity between spatial positions could be implemented by other list items getting a partial boost from context binding dependent on their distance to the currently cued position. Thereby the</w:t>
+        <w:t xml:space="preserve">framework was conceived as a measurement tool, it can thus be used to implement and test specific theoretical assumptions. For example, similarity between spatial positions could be implemented by other list items getting a partial boost from context binding dependent on their distance to the currently cued position. Thereby the</w:t>
       </w:r>
       <w:r>
         <w:t xml:space="preserve"> </w:t>

</xml_diff>